<commit_message>
Upload via SKKN-AI: phu-luc-survey_student.docx
</commit_message>
<xml_diff>
--- a/projects/skkn_1773776784610_eblasj47t/appendices/phu-luc-survey_student.docx
+++ b/projects/skkn_1773776784610_eblasj47t/appendices/phu-luc-survey_student.docx
@@ -1,53 +1,119 @@
 
-<file path=word/document.xml><?xml version="1.0" encoding="utf-8"?>
-<w:document xmlns:wpc="http://schemas.microsoft.com/office/word/2010/wordprocessingCanvas" xmlns:cx="http://schemas.microsoft.com/office/drawing/2014/chartex" xmlns:cx1="http://schemas.microsoft.com/office/drawing/2015/9/8/chartex" xmlns:cx2="http://schemas.microsoft.com/office/drawing/2015/10/21/chartex" xmlns:cx3="http://schemas.microsoft.com/office/drawing/2016/5/9/chartex" xmlns:cx4="http://schemas.microsoft.com/office/drawing/2016/5/10/chartex" xmlns:cx5="http://schemas.microsoft.com/office/drawing/2016/5/11/chartex" xmlns:cx6="http://schemas.microsoft.com/office/drawing/2016/5/12/chartex" xmlns:cx7="http://schemas.microsoft.com/office/drawing/2016/5/13/chartex" xmlns:cx8="http://schemas.microsoft.com/office/drawing/2016/5/14/chartex" xmlns:mc="http://schemas.openxmlformats.org/markup-compatibility/2006" xmlns:aink="http://schemas.microsoft.com/office/drawing/2016/ink" xmlns:am3d="http://schemas.microsoft.com/office/drawing/2017/model3d" xmlns:o="urn:schemas-microsoft-com:office:office" xmlns:oel="http://schemas.microsoft.com/office/2019/extlst" xmlns:r="http://schemas.openxmlformats.org/officeDocument/2006/relationships" xmlns:m="http://schemas.openxmlformats.org/officeDocument/2006/math" xmlns:v="urn:schemas-microsoft-com:vml" xmlns:wp14="http://schemas.microsoft.com/office/word/2010/wordprocessingDrawing" xmlns:wp="http://schemas.openxmlformats.org/drawingml/2006/wordprocessingDrawing" xmlns:w10="urn:schemas-microsoft-com:office:word" xmlns:w="http://schemas.openxmlformats.org/wordprocessingml/2006/main" xmlns:w14="http://schemas.microsoft.com/office/word/2010/wordml" xmlns:w15="http://schemas.microsoft.com/office/word/2012/wordml" xmlns:w16cex="http://schemas.microsoft.com/office/word/2018/wordml/cex" xmlns:w16cid="http://schemas.microsoft.com/office/word/2016/wordml/cid" xmlns:w16="http://schemas.microsoft.com/office/word/2018/wordml" xmlns:w16sdtdh="http://schemas.microsoft.com/office/word/2020/wordml/sdtdatahash" xmlns:w16se="http://schemas.microsoft.com/office/word/2015/wordml/symex" xmlns:wpg="http://schemas.microsoft.com/office/word/2010/wordprocessingGroup" xmlns:wpi="http://schemas.microsoft.com/office/word/2010/wordprocessingInk" xmlns:wne="http://schemas.microsoft.com/office/word/2006/wordml" xmlns:wps="http://schemas.microsoft.com/office/word/2010/wordprocessingShape" mc:Ignorable="w14 w15 w16se w16cid w16 w16cex w16sdtdh wp14">
-  <w:body>
-    <w:p>
-      <w:pPr>
-        <w:pageBreakBefore/>
-        <w:jc w:val="center"/>
-        <w:rPr>
-          <w:b/>
-          <w:bCs/>
-        </w:rPr>
-      </w:pPr>
-      <w:r>
-        <w:rPr>
-          <w:b/>
-          <w:bCs/>
-        </w:rPr>
-        <w:t>MINH CHỨNG PHỤ LỤC</w:t>
-      </w:r>
-    </w:p>
-    <w:p>
-      <w:pPr>
-        <w:spacing w:before="120" w:after="120"/>
-      </w:pPr>
-      <w:r>
-        <w:t>[NOI_DUNG_</w:t>
-      </w:r>
-      <w:r>
-        <w:t>PHU_LUC</w:t>
-      </w:r>
-      <w:r>
-        <w:t>]</w:t>
-      </w:r>
-    </w:p>
-    <w:sectPr>
-      <w:headerReference w:type="even" r:id="rId7"/>
-      <w:headerReference w:type="default" r:id="rId8"/>
-      <w:footerReference w:type="even" r:id="rId9"/>
-      <w:footerReference w:type="default" r:id="rId10"/>
-      <w:headerReference w:type="first" r:id="rId11"/>
-      <w:footerReference w:type="first" r:id="rId12"/>
-      <w:pgSz w:w="11906" w:h="16838"/>
-      <w:pgMar w:top="1134" w:right="1134" w:bottom="1134" w:left="1701" w:header="708" w:footer="708" w:gutter="0"/>
-      <w:pgNumType w:start="1"/>
-      <w:cols w:space="720"/>
-      <w:docGrid w:linePitch="360"/>
-    </w:sectPr>
-  </w:body>
-</w:document>
+<file path=word/document.xml><?xml version="1.0" encoding="UTF-8" standalone="yes"?>
+<w:document xmlns:wpc="http://schemas.microsoft.com/office/word/2010/wordprocessingCanvas" xmlns:cx="http://schemas.microsoft.com/office/drawing/2014/chartex" xmlns:cx1="http://schemas.microsoft.com/office/drawing/2015/9/8/chartex" xmlns:cx2="http://schemas.microsoft.com/office/drawing/2015/10/21/chartex" xmlns:cx3="http://schemas.microsoft.com/office/drawing/2016/5/9/chartex" xmlns:cx4="http://schemas.microsoft.com/office/drawing/2016/5/10/chartex" xmlns:cx5="http://schemas.microsoft.com/office/drawing/2016/5/11/chartex" xmlns:cx6="http://schemas.microsoft.com/office/drawing/2016/5/12/chartex" xmlns:cx7="http://schemas.microsoft.com/office/drawing/2016/5/13/chartex" xmlns:cx8="http://schemas.microsoft.com/office/drawing/2016/5/14/chartex" xmlns:mc="http://schemas.openxmlformats.org/markup-compatibility/2006" xmlns:aink="http://schemas.microsoft.com/office/drawing/2016/ink" xmlns:am3d="http://schemas.microsoft.com/office/drawing/2017/model3d" xmlns:o="urn:schemas-microsoft-com:office:office" xmlns:oel="http://schemas.microsoft.com/office/2019/extlst" xmlns:r="http://schemas.openxmlformats.org/officeDocument/2006/relationships" xmlns:m="http://schemas.openxmlformats.org/officeDocument/2006/math" xmlns:v="urn:schemas-microsoft-com:vml" xmlns:wp14="http://schemas.microsoft.com/office/word/2010/wordprocessingDrawing" xmlns:wp="http://schemas.openxmlformats.org/drawingml/2006/wordprocessingDrawing" xmlns:w10="urn:schemas-microsoft-com:office:word" xmlns:w="http://schemas.openxmlformats.org/wordprocessingml/2006/main" xmlns:w14="http://schemas.microsoft.com/office/word/2010/wordml" xmlns:w15="http://schemas.microsoft.com/office/word/2012/wordml" xmlns:w16cex="http://schemas.microsoft.com/office/word/2018/wordml/cex" xmlns:w16cid="http://schemas.microsoft.com/office/word/2016/wordml/cid" xmlns:w16="http://schemas.microsoft.com/office/word/2018/wordml" xmlns:w16sdtdh="http://schemas.microsoft.com/office/word/2020/wordml/sdtdatahash" xmlns:w16se="http://schemas.microsoft.com/office/word/2015/wordml/symex" xmlns:wpg="http://schemas.microsoft.com/office/word/2010/wordprocessingGroup" xmlns:wpi="http://schemas.microsoft.com/office/word/2010/wordprocessingInk" xmlns:wne="http://schemas.microsoft.com/office/word/2006/wordml" xmlns:wps="http://schemas.microsoft.com/office/word/2010/wordprocessingShape" mc:Ignorable="w14 w15 w16se w16cid w16 w16cex w16sdtdh wp14"><w:body><w:p><w:pPr><w:jc w:val="center"/></w:pPr><w:r><w:drawing><wp:inline cx="1524000" cy="1524000"><wp:extent cx="1524000" cy="1524000"/><wp:docPr id="999" name="QR"/><a:graphic xmlns:a="http://schemas.openxmlformats.org/drawingml/2006/main"><a:graphicData uri="http://schemas.openxmlformats.org/drawingml/2006/picture"><pic:pic xmlns:pic="http://schemas.openxmlformats.org/drawingml/2006/picture"><pic:nvPicPr><pic:cNvPr id="0" name="qr.png"/><pic:cNvPicPr/></pic:nvPicPr><pic:blipFill><a:blip xmlns:r="http://schemas.openxmlformats.org/officeDocument/2006/relationships" r:embed="rId999"/></a:blipFill><pic:spPr><a:xfrm><a:off x="0" y="0"/><a:ext cx="1524000" cy="1524000"/></a:xfrm><a:prstGeom prst="rect"><a:avLst/></a:prstGeom></pic:spPr></pic:pic></a:graphicData></a:graphic></wp:inline></w:drawing></w:r></w:p><w:p>
+<w:pPr>
+<w:jc w:val="both"/>
+<w:ind w:firstLine="720"/>
+<w:spacing w:line="360" w:lineRule="auto" w:after="120"/>
+</w:pPr>
+<w:r><w:t xml:space="preserve">Với vai trò là tác giả của Sáng kiến kinh nghiệm này, tôi xin trình bày thiết kế phiếu khảo sát học sinh, được sử dụng trước và sau quá trình thực nghiệm, nhằm đánh giá một cách khách quan và toàn diện sự thay đổi về hứng thú, mức độ hiểu bài và năng lực tưởng tượng không gian của học sinh lớp 12 khi ứng dụng công nghệ số trong mô hình hóa 3D. Các phiếu khảo sát này là công cụ quan trọng để thu thập dữ liệu định lượng, phục vụ cho việc phân tích hiệu quả của giải pháp.</w:t></w:r>
+</w:p><w:p>
+<w:pPr>
+<w:jc w:val="both"/>
+<w:ind w:firstLine="720"/>
+<w:spacing w:line="360" w:lineRule="auto" w:after="120"/>
+</w:pPr>
+<w:r><w:rPr><w:b/></w:rPr><w:t xml:space="preserve">PHIẾU KHẢO SÁT HỌC SINH (TRƯỚC THỰC NGHIỆM)</w:t></w:r>
+</w:p><w:p>
+<w:pPr>
+<w:jc w:val="both"/>
+<w:ind w:firstLine="720"/>
+<w:spacing w:line="360" w:lineRule="auto" w:after="120"/>
+</w:pPr>
+<w:r><w:rPr><w:b/></w:rPr><w:t xml:space="preserve">Trường THPT PPPPTTTT</w:t></w:r><w:r><w:t xml:space="preserve"> </w:t></w:r><w:r><w:rPr><w:b/></w:rPr><w:t xml:space="preserve">Lớp:</w:t></w:r><w:r><w:t xml:space="preserve"> 12A... </w:t></w:r><w:r><w:rPr><w:b/></w:rPr><w:t xml:space="preserve">Môn học:</w:t></w:r><w:r><w:t xml:space="preserve"> Toán </w:t></w:r><w:r><w:rPr><w:b/></w:rPr><w:t xml:space="preserve">Giáo viên:</w:t></w:r><w:r><w:t xml:space="preserve"> Lê Tuyết </w:t></w:r><w:r><w:rPr><w:b/></w:rPr><w:t xml:space="preserve">Năm học:</w:t></w:r><w:r><w:t xml:space="preserve"> 2025 - 2026 </w:t></w:r><w:r><w:rPr><w:b/></w:rPr><w:t xml:space="preserve">Địa chỉ:</w:t></w:r><w:r><w:t xml:space="preserve"> TP. Mỹ Tho, tỉnh Tiền Giang</w:t></w:r>
+</w:p><w:p>
+<w:pPr>
+<w:jc w:val="both"/>
+<w:ind w:firstLine="720"/>
+<w:spacing w:line="360" w:lineRule="auto" w:after="120"/>
+</w:pPr>
+<w:r><w:rPr><w:b/></w:rPr><w:t xml:space="preserve">Lời dẫn:</w:t></w:r><w:r><w:t xml:space="preserve"> Chào các em học sinh, Để tìm hiểu về thực trạng học tập môn Toán, đặc biệt là phần Hình học không gian, và mong muốn cải thiện chất lượng giảng dạy, tôi mong nhận được những chia sẻ chân thực từ các em thông qua phiếu khảo sát này. Thông tin các em cung cấp sẽ hoàn toàn được giữ bí mật và chỉ phục vụ cho mục đích nghiên cứu khoa học. Các em vui lòng đánh dấu (X) vào ô tương ứng với mức độ cảm nhận của mình đối với mỗi câu hỏi.</w:t></w:r>
+</w:p><w:p>
+<w:pPr>
+<w:jc w:val="both"/>
+<w:ind w:firstLine="720"/>
+<w:spacing w:line="360" w:lineRule="auto" w:after="120"/>
+</w:pPr>
+<w:r><w:rPr><w:b/></w:rPr><w:t xml:space="preserve">Thang đánh giá mức độ:</w:t></w:r>
+</w:p><w:p><w:pPr>
+<w:jc w:val="both"/>
+<w:tabs><w:tab w:val="left" w:pos="720"/></w:tabs>
+<w:ind w:left="720" w:hanging="360"/>
+<w:spacing w:after="60"/>
+</w:pPr><w:r><w:t xml:space="preserve">• </w:t><w:tab/></w:r><w:r><w:rPr><w:b/></w:rPr><w:t xml:space="preserve">1:</w:t></w:r><w:r><w:t xml:space="preserve"> Rất thấp / Hoàn toàn không đồng ý</w:t></w:r></w:p><w:p><w:pPr>
+<w:jc w:val="both"/>
+<w:tabs><w:tab w:val="left" w:pos="720"/></w:tabs>
+<w:ind w:left="720" w:hanging="360"/>
+<w:spacing w:after="60"/>
+</w:pPr><w:r><w:t xml:space="preserve">• </w:t><w:tab/></w:r><w:r><w:rPr><w:b/></w:rPr><w:t xml:space="preserve">2:</w:t></w:r><w:r><w:t xml:space="preserve"> Thấp / Ít đồng ý</w:t></w:r></w:p><w:p><w:pPr>
+<w:jc w:val="both"/>
+<w:tabs><w:tab w:val="left" w:pos="720"/></w:tabs>
+<w:ind w:left="720" w:hanging="360"/>
+<w:spacing w:after="60"/>
+</w:pPr><w:r><w:t xml:space="preserve">• </w:t><w:tab/></w:r><w:r><w:rPr><w:b/></w:rPr><w:t xml:space="preserve">3:</w:t></w:r><w:r><w:t xml:space="preserve"> Trung bình / Bình thường</w:t></w:r></w:p><w:p><w:pPr>
+<w:jc w:val="both"/>
+<w:tabs><w:tab w:val="left" w:pos="720"/></w:tabs>
+<w:ind w:left="720" w:hanging="360"/>
+<w:spacing w:after="60"/>
+</w:pPr><w:r><w:t xml:space="preserve">• </w:t><w:tab/></w:r><w:r><w:rPr><w:b/></w:rPr><w:t xml:space="preserve">4:</w:t></w:r><w:r><w:t xml:space="preserve"> Cao / Đồng ý</w:t></w:r></w:p><w:p><w:pPr>
+<w:jc w:val="both"/>
+<w:tabs><w:tab w:val="left" w:pos="720"/></w:tabs>
+<w:ind w:left="720" w:hanging="360"/>
+<w:spacing w:after="60"/>
+</w:pPr><w:r><w:t xml:space="preserve">• </w:t><w:tab/></w:r><w:r><w:rPr><w:b/></w:rPr><w:t xml:space="preserve">5:</w:t></w:r><w:r><w:t xml:space="preserve"> Rất cao / Hoàn toàn đồng ý</w:t></w:r></w:p><w:tbl><w:tblPr><w:tblW w:w="9360" w:type="dxa"/><w:tblBorders><w:top w:val="single" w:sz="4" w:space="0" w:color="000000"/><w:left w:val="single" w:sz="4" w:space="0" w:color="000000"/><w:bottom w:val="single" w:sz="4" w:space="0" w:color="000000"/><w:right w:val="single" w:sz="4" w:space="0" w:color="000000"/><w:insideH w:val="single" w:sz="4" w:space="0" w:color="000000"/><w:insideV w:val="single" w:sz="4" w:space="0" w:color="000000"/></w:tblBorders><w:tblLook w:val="04A0"/></w:tblPr><w:tblGrid><w:gridCol w:w="1337"/><w:gridCol w:w="1337"/><w:gridCol w:w="1337"/><w:gridCol w:w="1337"/><w:gridCol w:w="1337"/><w:gridCol w:w="1337"/><w:gridCol w:w="1337"/></w:tblGrid><w:tr><w:tc><w:tcPr><w:tcW w:w="1337" w:type="dxa"/><w:shd w:val="clear" w:color="auto" w:fill="D5E8F0"/></w:tcPr><w:p><w:pPr><w:jc w:val="center"/></w:pPr><w:r><w:t xml:space="preserve">STT</w:t></w:r></w:p></w:tc><w:tc><w:tcPr><w:tcW w:w="1337" w:type="dxa"/><w:shd w:val="clear" w:color="auto" w:fill="D5E8F0"/></w:tcPr><w:p><w:pPr><w:jc w:val="center"/></w:pPr><w:r><w:t xml:space="preserve">Nội dung câu hỏi</w:t></w:r></w:p></w:tc><w:tc><w:tcPr><w:tcW w:w="1337" w:type="dxa"/><w:shd w:val="clear" w:color="auto" w:fill="D5E8F0"/></w:tcPr><w:p><w:pPr><w:jc w:val="center"/></w:pPr><w:r><w:t xml:space="preserve">1</w:t></w:r></w:p></w:tc><w:tc><w:tcPr><w:tcW w:w="1337" w:type="dxa"/><w:shd w:val="clear" w:color="auto" w:fill="D5E8F0"/></w:tcPr><w:p><w:pPr><w:jc w:val="center"/></w:pPr><w:r><w:t xml:space="preserve">2</w:t></w:r></w:p></w:tc><w:tc><w:tcPr><w:tcW w:w="1337" w:type="dxa"/><w:shd w:val="clear" w:color="auto" w:fill="D5E8F0"/></w:tcPr><w:p><w:pPr><w:jc w:val="center"/></w:pPr><w:r><w:t xml:space="preserve">3</w:t></w:r></w:p></w:tc><w:tc><w:tcPr><w:tcW w:w="1337" w:type="dxa"/><w:shd w:val="clear" w:color="auto" w:fill="D5E8F0"/></w:tcPr><w:p><w:pPr><w:jc w:val="center"/></w:pPr><w:r><w:t xml:space="preserve">4</w:t></w:r></w:p></w:tc><w:tc><w:tcPr><w:tcW w:w="1337" w:type="dxa"/><w:shd w:val="clear" w:color="auto" w:fill="D5E8F0"/></w:tcPr><w:p><w:pPr><w:jc w:val="center"/></w:pPr><w:r><w:t xml:space="preserve">5</w:t></w:r></w:p></w:tc></w:tr><w:tr><w:tc><w:tcPr><w:tcW w:w="1337" w:type="dxa"/></w:tcPr><w:p><w:pPr><w:jc w:val="center"/></w:pPr><w:r><w:rPr><w:b/></w:rPr><w:t xml:space="preserve">A. Mức độ hứng thú và thái độ học tập</w:t></w:r></w:p></w:tc><w:tc><w:tcPr><w:tcW w:w="1337" w:type="dxa"/></w:tcPr><w:p><w:pPr><w:jc w:val="center"/></w:pPr></w:p></w:tc><w:tc><w:tcPr><w:tcW w:w="1337" w:type="dxa"/></w:tcPr><w:p><w:pPr><w:jc w:val="center"/></w:pPr></w:p></w:tc><w:tc><w:tcPr><w:tcW w:w="1337" w:type="dxa"/></w:tcPr><w:p><w:pPr><w:jc w:val="center"/></w:pPr></w:p></w:tc><w:tc><w:tcPr><w:tcW w:w="1337" w:type="dxa"/></w:tcPr><w:p><w:pPr><w:jc w:val="center"/></w:pPr></w:p></w:tc><w:tc><w:tcPr><w:tcW w:w="1337" w:type="dxa"/></w:tcPr><w:p><w:pPr><w:jc w:val="center"/></w:pPr></w:p></w:tc><w:tc><w:tcPr><w:tcW w:w="1337" w:type="dxa"/></w:tcPr><w:p><w:pPr><w:jc w:val="center"/></w:pPr></w:p></w:tc></w:tr><w:tr><w:tc><w:tcPr><w:tcW w:w="1337" w:type="dxa"/></w:tcPr><w:p><w:pPr><w:jc w:val="center"/></w:pPr><w:r><w:t xml:space="preserve">1</w:t></w:r></w:p></w:tc><w:tc><w:tcPr><w:tcW w:w="1337" w:type="dxa"/></w:tcPr><w:p><w:pPr><w:jc w:val="center"/></w:pPr><w:r><w:t xml:space="preserve">Bạn cảm thấy hứng thú với môn Toán nói chung.</w:t></w:r></w:p></w:tc><w:tc><w:tcPr><w:tcW w:w="1337" w:type="dxa"/></w:tcPr><w:p><w:pPr><w:jc w:val="center"/></w:pPr></w:p></w:tc><w:tc><w:tcPr><w:tcW w:w="1337" w:type="dxa"/></w:tcPr><w:p><w:pPr><w:jc w:val="center"/></w:pPr></w:p></w:tc><w:tc><w:tcPr><w:tcW w:w="1337" w:type="dxa"/></w:tcPr><w:p><w:pPr><w:jc w:val="center"/></w:pPr></w:p></w:tc><w:tc><w:tcPr><w:tcW w:w="1337" w:type="dxa"/></w:tcPr><w:p><w:pPr><w:jc w:val="center"/></w:pPr></w:p></w:tc><w:tc><w:tcPr><w:tcW w:w="1337" w:type="dxa"/></w:tcPr><w:p><w:pPr><w:jc w:val="center"/></w:pPr></w:p></w:tc></w:tr><w:tr><w:tc><w:tcPr><w:tcW w:w="1337" w:type="dxa"/></w:tcPr><w:p><w:pPr><w:jc w:val="center"/></w:pPr><w:r><w:t xml:space="preserve">2</w:t></w:r></w:p></w:tc><w:tc><w:tcPr><w:tcW w:w="1337" w:type="dxa"/></w:tcPr><w:p><w:pPr><w:jc w:val="center"/></w:pPr><w:r><w:t xml:space="preserve">Bạn cảm thấy hứng thú với chủ đề Hình học không gian (phương pháp tọa độ trong không gian).</w:t></w:r></w:p></w:tc><w:tc><w:tcPr><w:tcW w:w="1337" w:type="dxa"/></w:tcPr><w:p><w:pPr><w:jc w:val="center"/></w:pPr></w:p></w:tc><w:tc><w:tcPr><w:tcW w:w="1337" w:type="dxa"/></w:tcPr><w:p><w:pPr><w:jc w:val="center"/></w:pPr></w:p></w:tc><w:tc><w:tcPr><w:tcW w:w="1337" w:type="dxa"/></w:tcPr><w:p><w:pPr><w:jc w:val="center"/></w:pPr></w:p></w:tc><w:tc><w:tcPr><w:tcW w:w="1337" w:type="dxa"/></w:tcPr><w:p><w:pPr><w:jc w:val="center"/></w:pPr></w:p></w:tc><w:tc><w:tcPr><w:tcW w:w="1337" w:type="dxa"/></w:tcPr><w:p><w:pPr><w:jc w:val="center"/></w:pPr></w:p></w:tc></w:tr><w:tr><w:tc><w:tcPr><w:tcW w:w="1337" w:type="dxa"/></w:tcPr><w:p><w:pPr><w:jc w:val="center"/></w:pPr><w:r><w:t xml:space="preserve">3</w:t></w:r></w:p></w:tc><w:tc><w:tcPr><w:tcW w:w="1337" w:type="dxa"/></w:tcPr><w:p><w:pPr><w:jc w:val="center"/></w:pPr><w:r><w:t xml:space="preserve">Bạn có mong muốn được học các kiến thức Hình học không gian bằng phương pháp trực quan, sinh động hơn.</w:t></w:r></w:p></w:tc><w:tc><w:tcPr><w:tcW w:w="1337" w:type="dxa"/></w:tcPr><w:p><w:pPr><w:jc w:val="center"/></w:pPr></w:p></w:tc><w:tc><w:tcPr><w:tcW w:w="1337" w:type="dxa"/></w:tcPr><w:p><w:pPr><w:jc w:val="center"/></w:pPr></w:p></w:tc><w:tc><w:tcPr><w:tcW w:w="1337" w:type="dxa"/></w:tcPr><w:p><w:pPr><w:jc w:val="center"/></w:pPr></w:p></w:tc><w:tc><w:tcPr><w:tcW w:w="1337" w:type="dxa"/></w:tcPr><w:p><w:pPr><w:jc w:val="center"/></w:pPr></w:p></w:tc><w:tc><w:tcPr><w:tcW w:w="1337" w:type="dxa"/></w:tcPr><w:p><w:pPr><w:jc w:val="center"/></w:pPr></w:p></w:tc></w:tr><w:tr><w:tc><w:tcPr><w:tcW w:w="1337" w:type="dxa"/></w:tcPr><w:p><w:pPr><w:jc w:val="center"/></w:pPr><w:r><w:t xml:space="preserve">4</w:t></w:r></w:p></w:tc><w:tc><w:tcPr><w:tcW w:w="1337" w:type="dxa"/></w:tcPr><w:p><w:pPr><w:jc w:val="center"/></w:pPr><w:r><w:t xml:space="preserve">Bạn sẵn sàng tìm hiểu và sử dụng các công nghệ mới (ví dụ: phần mềm mô hình 3D) để hỗ trợ việc học.</w:t></w:r></w:p></w:tc><w:tc><w:tcPr><w:tcW w:w="1337" w:type="dxa"/></w:tcPr><w:p><w:pPr><w:jc w:val="center"/></w:pPr></w:p></w:tc><w:tc><w:tcPr><w:tcW w:w="1337" w:type="dxa"/></w:tcPr><w:p><w:pPr><w:jc w:val="center"/></w:pPr></w:p></w:tc><w:tc><w:tcPr><w:tcW w:w="1337" w:type="dxa"/></w:tcPr><w:p><w:pPr><w:jc w:val="center"/></w:pPr></w:p></w:tc><w:tc><w:tcPr><w:tcW w:w="1337" w:type="dxa"/></w:tcPr><w:p><w:pPr><w:jc w:val="center"/></w:pPr></w:p></w:tc><w:tc><w:tcPr><w:tcW w:w="1337" w:type="dxa"/></w:tcPr><w:p><w:pPr><w:jc w:val="center"/></w:pPr></w:p></w:tc></w:tr><w:tr><w:tc><w:tcPr><w:tcW w:w="1337" w:type="dxa"/></w:tcPr><w:p><w:pPr><w:jc w:val="center"/></w:pPr><w:r><w:t xml:space="preserve">5</w:t></w:r></w:p></w:tc><w:tc><w:tcPr><w:tcW w:w="1337" w:type="dxa"/></w:tcPr><w:p><w:pPr><w:jc w:val="center"/></w:pPr><w:r><w:t xml:space="preserve">Bạn cảm thấy môn Toán 12, đặc biệt là Hình học không gian, có vai trò quan trọng trong việc phát triển tư duy và định hướng nghề nghiệp.</w:t></w:r></w:p></w:tc><w:tc><w:tcPr><w:tcW w:w="1337" w:type="dxa"/></w:tcPr><w:p><w:pPr><w:jc w:val="center"/></w:pPr></w:p></w:tc><w:tc><w:tcPr><w:tcW w:w="1337" w:type="dxa"/></w:tcPr><w:p><w:pPr><w:jc w:val="center"/></w:pPr></w:p></w:tc><w:tc><w:tcPr><w:tcW w:w="1337" w:type="dxa"/></w:tcPr><w:p><w:pPr><w:jc w:val="center"/></w:pPr></w:p></w:tc><w:tc><w:tcPr><w:tcW w:w="1337" w:type="dxa"/></w:tcPr><w:p><w:pPr><w:jc w:val="center"/></w:pPr></w:p></w:tc><w:tc><w:tcPr><w:tcW w:w="1337" w:type="dxa"/></w:tcPr><w:p><w:pPr><w:jc w:val="center"/></w:pPr></w:p></w:tc></w:tr><w:tr><w:tc><w:tcPr><w:tcW w:w="1337" w:type="dxa"/></w:tcPr><w:p><w:pPr><w:jc w:val="center"/></w:pPr><w:r><w:rPr><w:b/></w:rPr><w:t xml:space="preserve">B. Mức độ hiểu bài và năng lực tưởng tượng không gian</w:t></w:r></w:p></w:tc><w:tc><w:tcPr><w:tcW w:w="1337" w:type="dxa"/></w:tcPr><w:p><w:pPr><w:jc w:val="center"/></w:pPr></w:p></w:tc><w:tc><w:tcPr><w:tcW w:w="1337" w:type="dxa"/></w:tcPr><w:p><w:pPr><w:jc w:val="center"/></w:pPr></w:p></w:tc><w:tc><w:tcPr><w:tcW w:w="1337" w:type="dxa"/></w:tcPr><w:p><w:pPr><w:jc w:val="center"/></w:pPr></w:p></w:tc><w:tc><w:tcPr><w:tcW w:w="1337" w:type="dxa"/></w:tcPr><w:p><w:pPr><w:jc w:val="center"/></w:pPr></w:p></w:tc><w:tc><w:tcPr><w:tcW w:w="1337" w:type="dxa"/></w:tcPr><w:p><w:pPr><w:jc w:val="center"/></w:pPr></w:p></w:tc><w:tc><w:tcPr><w:tcW w:w="1337" w:type="dxa"/></w:tcPr><w:p><w:pPr><w:jc w:val="center"/></w:pPr></w:p></w:tc></w:tr><w:tr><w:tc><w:tcPr><w:tcW w:w="1337" w:type="dxa"/></w:tcPr><w:p><w:pPr><w:jc w:val="center"/></w:pPr><w:r><w:t xml:space="preserve">6</w:t></w:r></w:p></w:tc><w:tc><w:tcPr><w:tcW w:w="1337" w:type="dxa"/></w:tcPr><w:p><w:pPr><w:jc w:val="center"/></w:pPr><w:r><w:t xml:space="preserve">Bạn cảm thấy dễ dàng khi hình dung các đối tượng hình học không gian (điểm, đường thẳng, mặt phẳng, khối đa diện) trong không gian ba chiều.</w:t></w:r></w:p></w:tc><w:tc><w:tcPr><w:tcW w:w="1337" w:type="dxa"/></w:tcPr><w:p><w:pPr><w:jc w:val="center"/></w:pPr></w:p></w:tc><w:tc><w:tcPr><w:tcW w:w="1337" w:type="dxa"/></w:tcPr><w:p><w:pPr><w:jc w:val="center"/></w:pPr></w:p></w:tc><w:tc><w:tcPr><w:tcW w:w="1337" w:type="dxa"/></w:tcPr><w:p><w:pPr><w:jc w:val="center"/></w:pPr></w:p></w:tc><w:tc><w:tcPr><w:tcW w:w="1337" w:type="dxa"/></w:tcPr><w:p><w:pPr><w:jc w:val="center"/></w:pPr></w:p></w:tc><w:tc><w:tcPr><w:tcW w:w="1337" w:type="dxa"/></w:tcPr><w:p><w:pPr><w:jc w:val="center"/></w:pPr></w:p></w:tc></w:tr><w:tr><w:tc><w:tcPr><w:tcW w:w="1337" w:type="dxa"/></w:tcPr><w:p><w:pPr><w:jc w:val="center"/></w:pPr><w:r><w:t xml:space="preserve">7</w:t></w:r></w:p></w:tc><w:tc><w:tcPr><w:tcW w:w="1337" w:type="dxa"/></w:tcPr><w:p><w:pPr><w:jc w:val="center"/></w:pPr><w:r><w:t xml:space="preserve">Bạn tự tin giải quyết các bài toán liên quan đến phương pháp tọa độ trong không gian.</w:t></w:r></w:p></w:tc><w:tc><w:tcPr><w:tcW w:w="1337" w:type="dxa"/></w:tcPr><w:p><w:pPr><w:jc w:val="center"/></w:pPr></w:p></w:tc><w:tc><w:tcPr><w:tcW w:w="1337" w:type="dxa"/></w:tcPr><w:p><w:pPr><w:jc w:val="center"/></w:pPr></w:p></w:tc><w:tc><w:tcPr><w:tcW w:w="1337" w:type="dxa"/></w:tcPr><w:p><w:pPr><w:jc w:val="center"/></w:pPr></w:p></w:tc><w:tc><w:tcPr><w:tcW w:w="1337" w:type="dxa"/></w:tcPr><w:p><w:pPr><w:jc w:val="center"/></w:pPr></w:p></w:tc><w:tc><w:tcPr><w:tcW w:w="1337" w:type="dxa"/></w:tcPr><w:p><w:pPr><w:jc w:val="center"/></w:pPr></w:p></w:tc></w:tr><w:tr><w:tc><w:tcPr><w:tcW w:w="1337" w:type="dxa"/></w:tcPr><w:p><w:pPr><w:jc w:val="center"/></w:pPr><w:r><w:t xml:space="preserve">8</w:t></w:r></w:p></w:tc><w:tc><w:tcPr><w:tcW w:w="1337" w:type="dxa"/></w:tcPr><w:p><w:pPr><w:jc w:val="center"/></w:pPr><w:r><w:t xml:space="preserve">Bạn hiểu rõ bản chất của các khái niệm hình học không gian (ví dụ: phương trình mặt phẳng, đường thẳng, khoảng cách, góc).</w:t></w:r></w:p></w:tc><w:tc><w:tcPr><w:tcW w:w="1337" w:type="dxa"/></w:tcPr><w:p><w:pPr><w:jc w:val="center"/></w:pPr></w:p></w:tc><w:tc><w:tcPr><w:tcW w:w="1337" w:type="dxa"/></w:tcPr><w:p><w:pPr><w:jc w:val="center"/></w:pPr></w:p></w:tc><w:tc><w:tcPr><w:tcW w:w="1337" w:type="dxa"/></w:tcPr><w:p><w:pPr><w:jc w:val="center"/></w:pPr></w:p></w:tc><w:tc><w:tcPr><w:tcW w:w="1337" w:type="dxa"/></w:tcPr><w:p><w:pPr><w:jc w:val="center"/></w:pPr></w:p></w:tc><w:tc><w:tcPr><w:tcW w:w="1337" w:type="dxa"/></w:tcPr><w:p><w:pPr><w:jc w:val="center"/></w:pPr></w:p></w:tc></w:tr><w:tr><w:tc><w:tcPr><w:tcW w:w="1337" w:type="dxa"/></w:tcPr><w:p><w:pPr><w:jc w:val="center"/></w:pPr><w:r><w:t xml:space="preserve">9</w:t></w:r></w:p></w:tc><w:tc><w:tcPr><w:tcW w:w="1337" w:type="dxa"/></w:tcPr><w:p><w:pPr><w:jc w:val="center"/></w:pPr><w:r><w:t xml:space="preserve">Bạn có thể áp dụng kiến thức Hình học không gian vào giải quyết các bài toán thực tế hoặc các môn học khác.</w:t></w:r></w:p></w:tc><w:tc><w:tcPr><w:tcW w:w="1337" w:type="dxa"/></w:tcPr><w:p><w:pPr><w:jc w:val="center"/></w:pPr></w:p></w:tc><w:tc><w:tcPr><w:tcW w:w="1337" w:type="dxa"/></w:tcPr><w:p><w:pPr><w:jc w:val="center"/></w:pPr></w:p></w:tc><w:tc><w:tcPr><w:tcW w:w="1337" w:type="dxa"/></w:tcPr><w:p><w:pPr><w:jc w:val="center"/></w:pPr></w:p></w:tc><w:tc><w:tcPr><w:tcW w:w="1337" w:type="dxa"/></w:tcPr><w:p><w:pPr><w:jc w:val="center"/></w:pPr></w:p></w:tc><w:tc><w:tcPr><w:tcW w:w="1337" w:type="dxa"/></w:tcPr><w:p><w:pPr><w:jc w:val="center"/></w:pPr></w:p></w:tc></w:tr><w:tr><w:tc><w:tcPr><w:tcW w:w="1337" w:type="dxa"/></w:tcPr><w:p><w:pPr><w:jc w:val="center"/></w:pPr><w:r><w:t xml:space="preserve">10</w:t></w:r></w:p></w:tc><w:tc><w:tcPr><w:tcW w:w="1337" w:type="dxa"/></w:tcPr><w:p><w:pPr><w:jc w:val="center"/></w:pPr><w:r><w:t xml:space="preserve">Bạn cảm thấy khó khăn khi phải biểu diễn các hình không gian 3D trên giấy hoặc bảng.</w:t></w:r></w:p></w:tc><w:tc><w:tcPr><w:tcW w:w="1337" w:type="dxa"/></w:tcPr><w:p><w:pPr><w:jc w:val="center"/></w:pPr></w:p></w:tc><w:tc><w:tcPr><w:tcW w:w="1337" w:type="dxa"/></w:tcPr><w:p><w:pPr><w:jc w:val="center"/></w:pPr></w:p></w:tc><w:tc><w:tcPr><w:tcW w:w="1337" w:type="dxa"/></w:tcPr><w:p><w:pPr><w:jc w:val="center"/></w:pPr></w:p></w:tc><w:tc><w:tcPr><w:tcW w:w="1337" w:type="dxa"/></w:tcPr><w:p><w:pPr><w:jc w:val="center"/></w:pPr></w:p></w:tc><w:tc><w:tcPr><w:tcW w:w="1337" w:type="dxa"/></w:tcPr><w:p><w:pPr><w:jc w:val="center"/></w:pPr></w:p></w:tc></w:tr><w:tr><w:tc><w:tcPr><w:tcW w:w="1337" w:type="dxa"/></w:tcPr><w:p><w:pPr><w:jc w:val="center"/></w:pPr><w:r><w:rPr><w:b/></w:rPr><w:t xml:space="preserve">C. Nhận thức về phương pháp và kỹ năng tự học</w:t></w:r></w:p></w:tc><w:tc><w:tcPr><w:tcW w:w="1337" w:type="dxa"/></w:tcPr><w:p><w:pPr><w:jc w:val="center"/></w:pPr></w:p></w:tc><w:tc><w:tcPr><w:tcW w:w="1337" w:type="dxa"/></w:tcPr><w:p><w:pPr><w:jc w:val="center"/></w:pPr></w:p></w:tc><w:tc><w:tcPr><w:tcW w:w="1337" w:type="dxa"/></w:tcPr><w:p><w:pPr><w:jc w:val="center"/></w:pPr></w:p></w:tc><w:tc><w:tcPr><w:tcW w:w="1337" w:type="dxa"/></w:tcPr><w:p><w:pPr><w:jc w:val="center"/></w:pPr></w:p></w:tc><w:tc><w:tcPr><w:tcW w:w="1337" w:type="dxa"/></w:tcPr><w:p><w:pPr><w:jc w:val="center"/></w:pPr></w:p></w:tc><w:tc><w:tcPr><w:tcW w:w="1337" w:type="dxa"/></w:tcPr><w:p><w:pPr><w:jc w:val="center"/></w:pPr></w:p></w:tc></w:tr><w:tr><w:tc><w:tcPr><w:tcW w:w="1337" w:type="dxa"/></w:tcPr><w:p><w:pPr><w:jc w:val="center"/></w:pPr><w:r><w:t xml:space="preserve">11</w:t></w:r></w:p></w:tc><w:tc><w:tcPr><w:tcW w:w="1337" w:type="dxa"/></w:tcPr><w:p><w:pPr><w:jc w:val="center"/></w:pPr><w:r><w:t xml:space="preserve">Bạn tin rằng việc sử dụng công nghệ số (mô hình hóa 3D) sẽ giúp bạn hình dung và hiểu bài tốt hơn trong Hình học không gian.</w:t></w:r></w:p></w:tc><w:tc><w:tcPr><w:tcW w:w="1337" w:type="dxa"/></w:tcPr><w:p><w:pPr><w:jc w:val="center"/></w:pPr></w:p></w:tc><w:tc><w:tcPr><w:tcW w:w="1337" w:type="dxa"/></w:tcPr><w:p><w:pPr><w:jc w:val="center"/></w:pPr></w:p></w:tc><w:tc><w:tcPr><w:tcW w:w="1337" w:type="dxa"/></w:tcPr><w:p><w:pPr><w:jc w:val="center"/></w:pPr></w:p></w:tc><w:tc><w:tcPr><w:tcW w:w="1337" w:type="dxa"/></w:tcPr><w:p><w:pPr><w:jc w:val="center"/></w:pPr></w:p></w:tc><w:tc><w:tcPr><w:tcW w:w="1337" w:type="dxa"/></w:tcPr><w:p><w:pPr><w:jc w:val="center"/></w:pPr></w:p></w:tc></w:tr><w:tr><w:tc><w:tcPr><w:tcW w:w="1337" w:type="dxa"/></w:tcPr><w:p><w:pPr><w:jc w:val="center"/></w:pPr><w:r><w:t xml:space="preserve">12</w:t></w:r></w:p></w:tc><w:tc><w:tcPr><w:tcW w:w="1337" w:type="dxa"/></w:tcPr><w:p><w:pPr><w:jc w:val="center"/></w:pPr><w:r><w:t xml:space="preserve">Bạn cảm thấy cần được hướng dẫn cụ thể hơn về cách tự học và khám phá kiến thức Hình học không gian.</w:t></w:r></w:p></w:tc><w:tc><w:tcPr><w:tcW w:w="1337" w:type="dxa"/></w:tcPr><w:p><w:pPr><w:jc w:val="center"/></w:pPr></w:p></w:tc><w:tc><w:tcPr><w:tcW w:w="1337" w:type="dxa"/></w:tcPr><w:p><w:pPr><w:jc w:val="center"/></w:pPr></w:p></w:tc><w:tc><w:tcPr><w:tcW w:w="1337" w:type="dxa"/></w:tcPr><w:p><w:pPr><w:jc w:val="center"/></w:pPr></w:p></w:tc><w:tc><w:tcPr><w:tcW w:w="1337" w:type="dxa"/></w:tcPr><w:p><w:pPr><w:jc w:val="center"/></w:pPr></w:p></w:tc><w:tc><w:tcPr><w:tcW w:w="1337" w:type="dxa"/></w:tcPr><w:p><w:pPr><w:jc w:val="center"/></w:pPr></w:p></w:tc></w:tr><w:tr><w:tc><w:tcPr><w:tcW w:w="1337" w:type="dxa"/></w:tcPr><w:p><w:pPr><w:jc w:val="center"/></w:pPr><w:r><w:t xml:space="preserve">13</w:t></w:r></w:p></w:tc><w:tc><w:tcPr><w:tcW w:w="1337" w:type="dxa"/></w:tcPr><w:p><w:pPr><w:jc w:val="center"/></w:pPr><w:r><w:t xml:space="preserve">Bạn cảm thấy phương pháp học hiện tại giúp bạn chủ động tìm tòi và khám phá kiến thức Hình học không gian.</w:t></w:r></w:p></w:tc><w:tc><w:tcPr><w:tcW w:w="1337" w:type="dxa"/></w:tcPr><w:p><w:pPr><w:jc w:val="center"/></w:pPr></w:p></w:tc><w:tc><w:tcPr><w:tcW w:w="1337" w:type="dxa"/></w:tcPr><w:p><w:pPr><w:jc w:val="center"/></w:pPr></w:p></w:tc><w:tc><w:tcPr><w:tcW w:w="1337" w:type="dxa"/></w:tcPr><w:p><w:pPr><w:jc w:val="center"/></w:pPr></w:p></w:tc><w:tc><w:tcPr><w:tcW w:w="1337" w:type="dxa"/></w:tcPr><w:p><w:pPr><w:jc w:val="center"/></w:pPr></w:p></w:tc><w:tc><w:tcPr><w:tcW w:w="1337" w:type="dxa"/></w:tcPr><w:p><w:pPr><w:jc w:val="center"/></w:pPr></w:p></w:tc></w:tr><w:tr><w:tc><w:tcPr><w:tcW w:w="1337" w:type="dxa"/></w:tcPr><w:p><w:pPr><w:jc w:val="center"/></w:pPr><w:r><w:t xml:space="preserve">14</w:t></w:r></w:p></w:tc><w:tc><w:tcPr><w:tcW w:w="1337" w:type="dxa"/></w:tcPr><w:p><w:pPr><w:jc w:val="center"/></w:pPr><w:r><w:t xml:space="preserve">Bạn cảm thấy năng lực tưởng tượng không gian của mình hiện đang ở mức tốt.</w:t></w:r></w:p></w:tc><w:tc><w:tcPr><w:tcW w:w="1337" w:type="dxa"/></w:tcPr><w:p><w:pPr><w:jc w:val="center"/></w:pPr></w:p></w:tc><w:tc><w:tcPr><w:tcW w:w="1337" w:type="dxa"/></w:tcPr><w:p><w:pPr><w:jc w:val="center"/></w:pPr></w:p></w:tc><w:tc><w:tcPr><w:tcW w:w="1337" w:type="dxa"/></w:tcPr><w:p><w:pPr><w:jc w:val="center"/></w:pPr></w:p></w:tc><w:tc><w:tcPr><w:tcW w:w="1337" w:type="dxa"/></w:tcPr><w:p><w:pPr><w:jc w:val="center"/></w:pPr></w:p></w:tc><w:tc><w:tcPr><w:tcW w:w="1337" w:type="dxa"/></w:tcPr><w:p><w:pPr><w:jc w:val="center"/></w:pPr></w:p></w:tc></w:tr><w:tr><w:tc><w:tcPr><w:tcW w:w="1337" w:type="dxa"/></w:tcPr><w:p><w:pPr><w:jc w:val="center"/></w:pPr><w:r><w:t xml:space="preserve">15</w:t></w:r></w:p></w:tc><w:tc><w:tcPr><w:tcW w:w="1337" w:type="dxa"/></w:tcPr><w:p><w:pPr><w:jc w:val="center"/></w:pPr><w:r><w:t xml:space="preserve">Bạn cảm thấy việc học Hình học không gian thường khiến bạn mất tập trung hoặc dễ chán nản.</w:t></w:r></w:p></w:tc><w:tc><w:tcPr><w:tcW w:w="1337" w:type="dxa"/></w:tcPr><w:p><w:pPr><w:jc w:val="center"/></w:pPr></w:p></w:tc><w:tc><w:tcPr><w:tcW w:w="1337" w:type="dxa"/></w:tcPr><w:p><w:pPr><w:jc w:val="center"/></w:pPr></w:p></w:tc><w:tc><w:tcPr><w:tcW w:w="1337" w:type="dxa"/></w:tcPr><w:p><w:pPr><w:jc w:val="center"/></w:pPr></w:p></w:tc><w:tc><w:tcPr><w:tcW w:w="1337" w:type="dxa"/></w:tcPr><w:p><w:pPr><w:jc w:val="center"/></w:pPr></w:p></w:tc><w:tc><w:tcPr><w:tcW w:w="1337" w:type="dxa"/></w:tcPr><w:p><w:pPr><w:jc w:val="center"/></w:pPr></w:p></w:tc></w:tr></w:tbl><w:p><w:pPr><w:spacing w:after="120"/></w:pPr></w:p><w:p><w:r><w:br w:type="page"/></w:r></w:p><w:p>
+<w:pPr>
+<w:jc w:val="both"/>
+<w:ind w:firstLine="720"/>
+<w:spacing w:line="360" w:lineRule="auto" w:after="120"/>
+</w:pPr>
+<w:r><w:rPr><w:b/></w:rPr><w:t xml:space="preserve">PHIẾU KHẢO SÁT HỌC SINH (SAU THỰC NGHIỆM)</w:t></w:r>
+</w:p><w:p>
+<w:pPr>
+<w:jc w:val="both"/>
+<w:ind w:firstLine="720"/>
+<w:spacing w:line="360" w:lineRule="auto" w:after="120"/>
+</w:pPr>
+<w:r><w:rPr><w:b/></w:rPr><w:t xml:space="preserve">Trường THPT PPPPTTTT</w:t></w:r><w:r><w:t xml:space="preserve"> </w:t></w:r><w:r><w:rPr><w:b/></w:rPr><w:t xml:space="preserve">Lớp:</w:t></w:r><w:r><w:t xml:space="preserve"> 12A... </w:t></w:r><w:r><w:rPr><w:b/></w:rPr><w:t xml:space="preserve">Môn học:</w:t></w:r><w:r><w:t xml:space="preserve"> Toán </w:t></w:r><w:r><w:rPr><w:b/></w:rPr><w:t xml:space="preserve">Giáo viên:</w:t></w:r><w:r><w:t xml:space="preserve"> Lê Tuyết </w:t></w:r><w:r><w:rPr><w:b/></w:rPr><w:t xml:space="preserve">Năm học:</w:t></w:r><w:r><w:t xml:space="preserve"> 2025 - 2026 </w:t></w:r><w:r><w:rPr><w:b/></w:rPr><w:t xml:space="preserve">Địa chỉ:</w:t></w:r><w:r><w:t xml:space="preserve"> TP. Mỹ Tho, tỉnh Tiền Giang</w:t></w:r>
+</w:p><w:p>
+<w:pPr>
+<w:jc w:val="both"/>
+<w:ind w:firstLine="720"/>
+<w:spacing w:line="360" w:lineRule="auto" w:after="120"/>
+</w:pPr>
+<w:r><w:rPr><w:b/></w:rPr><w:t xml:space="preserve">Lời dẫn:</w:t></w:r><w:r><w:t xml:space="preserve"> Chào các em học sinh, Sau một thời gian chúng ta cùng nhau trải nghiệm phương pháp học tập mới với ứng dụng công nghệ số trong mô hình hóa 3D cho chủ đề Hình học không gian, tôi rất mong nhận được những đánh giá và phản hồi chân thực từ các em. Những ý kiến này vô cùng quan trọng để tôi có thể tiếp tục đổi mới phương pháp dạy học, nhằm nâng cao chất lượng giáo dục. Các em vui lòng đánh dấu (X) vào ô tương ứng với mức độ cảm nhận của mình đối với mỗi câu hỏi.</w:t></w:r>
+</w:p><w:p>
+<w:pPr>
+<w:jc w:val="both"/>
+<w:ind w:firstLine="720"/>
+<w:spacing w:line="360" w:lineRule="auto" w:after="120"/>
+</w:pPr>
+<w:r><w:rPr><w:b/></w:rPr><w:t xml:space="preserve">Thang đánh giá mức độ:</w:t></w:r>
+</w:p><w:p><w:pPr>
+<w:jc w:val="both"/>
+<w:tabs><w:tab w:val="left" w:pos="720"/></w:tabs>
+<w:ind w:left="720" w:hanging="360"/>
+<w:spacing w:after="60"/>
+</w:pPr><w:r><w:t xml:space="preserve">• </w:t><w:tab/></w:r><w:r><w:rPr><w:b/></w:rPr><w:t xml:space="preserve">1:</w:t></w:r><w:r><w:t xml:space="preserve"> Rất thấp / Hoàn toàn không đồng ý</w:t></w:r></w:p><w:p><w:pPr>
+<w:jc w:val="both"/>
+<w:tabs><w:tab w:val="left" w:pos="720"/></w:tabs>
+<w:ind w:left="720" w:hanging="360"/>
+<w:spacing w:after="60"/>
+</w:pPr><w:r><w:t xml:space="preserve">• </w:t><w:tab/></w:r><w:r><w:rPr><w:b/></w:rPr><w:t xml:space="preserve">2:</w:t></w:r><w:r><w:t xml:space="preserve"> Thấp / Ít đồng ý</w:t></w:r></w:p><w:p><w:pPr>
+<w:jc w:val="both"/>
+<w:tabs><w:tab w:val="left" w:pos="720"/></w:tabs>
+<w:ind w:left="720" w:hanging="360"/>
+<w:spacing w:after="60"/>
+</w:pPr><w:r><w:t xml:space="preserve">• </w:t><w:tab/></w:r><w:r><w:rPr><w:b/></w:rPr><w:t xml:space="preserve">3:</w:t></w:r><w:r><w:t xml:space="preserve"> Trung bình / Bình thường</w:t></w:r></w:p><w:p><w:pPr>
+<w:jc w:val="both"/>
+<w:tabs><w:tab w:val="left" w:pos="720"/></w:tabs>
+<w:ind w:left="720" w:hanging="360"/>
+<w:spacing w:after="60"/>
+</w:pPr><w:r><w:t xml:space="preserve">• </w:t><w:tab/></w:r><w:r><w:rPr><w:b/></w:rPr><w:t xml:space="preserve">4:</w:t></w:r><w:r><w:t xml:space="preserve"> Cao / Đồng ý</w:t></w:r></w:p><w:p><w:pPr>
+<w:jc w:val="both"/>
+<w:tabs><w:tab w:val="left" w:pos="720"/></w:tabs>
+<w:ind w:left="720" w:hanging="360"/>
+<w:spacing w:after="60"/>
+</w:pPr><w:r><w:t xml:space="preserve">• </w:t><w:tab/></w:r><w:r><w:rPr><w:b/></w:rPr><w:t xml:space="preserve">5:</w:t></w:r><w:r><w:t xml:space="preserve"> Rất cao / Hoàn toàn đồng ý</w:t></w:r></w:p><w:tbl><w:tblPr><w:tblW w:w="9360" w:type="dxa"/><w:tblBorders><w:top w:val="single" w:sz="4" w:space="0" w:color="000000"/><w:left w:val="single" w:sz="4" w:space="0" w:color="000000"/><w:bottom w:val="single" w:sz="4" w:space="0" w:color="000000"/><w:right w:val="single" w:sz="4" w:space="0" w:color="000000"/><w:insideH w:val="single" w:sz="4" w:space="0" w:color="000000"/><w:insideV w:val="single" w:sz="4" w:space="0" w:color="000000"/></w:tblBorders><w:tblLook w:val="04A0"/></w:tblPr><w:tblGrid><w:gridCol w:w="1337"/><w:gridCol w:w="1337"/><w:gridCol w:w="1337"/><w:gridCol w:w="1337"/><w:gridCol w:w="1337"/><w:gridCol w:w="1337"/><w:gridCol w:w="1337"/></w:tblGrid><w:tr><w:tc><w:tcPr><w:tcW w:w="1337" w:type="dxa"/><w:shd w:val="clear" w:color="auto" w:fill="D5E8F0"/></w:tcPr><w:p><w:pPr><w:jc w:val="center"/></w:pPr><w:r><w:t xml:space="preserve">STT</w:t></w:r></w:p></w:tc><w:tc><w:tcPr><w:tcW w:w="1337" w:type="dxa"/><w:shd w:val="clear" w:color="auto" w:fill="D5E8F0"/></w:tcPr><w:p><w:pPr><w:jc w:val="center"/></w:pPr><w:r><w:t xml:space="preserve">Nội dung câu hỏi</w:t></w:r></w:p></w:tc><w:tc><w:tcPr><w:tcW w:w="1337" w:type="dxa"/><w:shd w:val="clear" w:color="auto" w:fill="D5E8F0"/></w:tcPr><w:p><w:pPr><w:jc w:val="center"/></w:pPr><w:r><w:t xml:space="preserve">1</w:t></w:r></w:p></w:tc><w:tc><w:tcPr><w:tcW w:w="1337" w:type="dxa"/><w:shd w:val="clear" w:color="auto" w:fill="D5E8F0"/></w:tcPr><w:p><w:pPr><w:jc w:val="center"/></w:pPr><w:r><w:t xml:space="preserve">2</w:t></w:r></w:p></w:tc><w:tc><w:tcPr><w:tcW w:w="1337" w:type="dxa"/><w:shd w:val="clear" w:color="auto" w:fill="D5E8F0"/></w:tcPr><w:p><w:pPr><w:jc w:val="center"/></w:pPr><w:r><w:t xml:space="preserve">3</w:t></w:r></w:p></w:tc><w:tc><w:tcPr><w:tcW w:w="1337" w:type="dxa"/><w:shd w:val="clear" w:color="auto" w:fill="D5E8F0"/></w:tcPr><w:p><w:pPr><w:jc w:val="center"/></w:pPr><w:r><w:t xml:space="preserve">4</w:t></w:r></w:p></w:tc><w:tc><w:tcPr><w:tcW w:w="1337" w:type="dxa"/><w:shd w:val="clear" w:color="auto" w:fill="D5E8F0"/></w:tcPr><w:p><w:pPr><w:jc w:val="center"/></w:pPr><w:r><w:t xml:space="preserve">5</w:t></w:r></w:p></w:tc></w:tr><w:tr><w:tc><w:tcPr><w:tcW w:w="1337" w:type="dxa"/></w:tcPr><w:p><w:pPr><w:jc w:val="center"/></w:pPr><w:r><w:rPr><w:b/></w:rPr><w:t xml:space="preserve">A. Mức độ hứng thú và thái độ học tập sau thực nghiệm</w:t></w:r></w:p></w:tc><w:tc><w:tcPr><w:tcW w:w="1337" w:type="dxa"/></w:tcPr><w:p><w:pPr><w:jc w:val="center"/></w:pPr></w:p></w:tc><w:tc><w:tcPr><w:tcW w:w="1337" w:type="dxa"/></w:tcPr><w:p><w:pPr><w:jc w:val="center"/></w:pPr></w:p></w:tc><w:tc><w:tcPr><w:tcW w:w="1337" w:type="dxa"/></w:tcPr><w:p><w:pPr><w:jc w:val="center"/></w:pPr></w:p></w:tc><w:tc><w:tcPr><w:tcW w:w="1337" w:type="dxa"/></w:tcPr><w:p><w:pPr><w:jc w:val="center"/></w:pPr></w:p></w:tc><w:tc><w:tcPr><w:tcW w:w="1337" w:type="dxa"/></w:tcPr><w:p><w:pPr><w:jc w:val="center"/></w:pPr></w:p></w:tc><w:tc><w:tcPr><w:tcW w:w="1337" w:type="dxa"/></w:tcPr><w:p><w:pPr><w:jc w:val="center"/></w:pPr></w:p></w:tc></w:tr><w:tr><w:tc><w:tcPr><w:tcW w:w="1337" w:type="dxa"/></w:tcPr><w:p><w:pPr><w:jc w:val="center"/></w:pPr><w:r><w:t xml:space="preserve">1</w:t></w:r></w:p></w:tc><w:tc><w:tcPr><w:tcW w:w="1337" w:type="dxa"/></w:tcPr><w:p><w:pPr><w:jc w:val="center"/></w:pPr><w:r><w:t xml:space="preserve">Bạn cảm thấy hứng thú với môn Toán nói chung đã được cải thiện.</w:t></w:r></w:p></w:tc><w:tc><w:tcPr><w:tcW w:w="1337" w:type="dxa"/></w:tcPr><w:p><w:pPr><w:jc w:val="center"/></w:pPr></w:p></w:tc><w:tc><w:tcPr><w:tcW w:w="1337" w:type="dxa"/></w:tcPr><w:p><w:pPr><w:jc w:val="center"/></w:pPr></w:p></w:tc><w:tc><w:tcPr><w:tcW w:w="1337" w:type="dxa"/></w:tcPr><w:p><w:pPr><w:jc w:val="center"/></w:pPr></w:p></w:tc><w:tc><w:tcPr><w:tcW w:w="1337" w:type="dxa"/></w:tcPr><w:p><w:pPr><w:jc w:val="center"/></w:pPr></w:p></w:tc><w:tc><w:tcPr><w:tcW w:w="1337" w:type="dxa"/></w:tcPr><w:p><w:pPr><w:jc w:val="center"/></w:pPr></w:p></w:tc></w:tr><w:tr><w:tc><w:tcPr><w:tcW w:w="1337" w:type="dxa"/></w:tcPr><w:p><w:pPr><w:jc w:val="center"/></w:pPr><w:r><w:t xml:space="preserve">2</w:t></w:r></w:p></w:tc><w:tc><w:tcPr><w:tcW w:w="1337" w:type="dxa"/></w:tcPr><w:p><w:pPr><w:jc w:val="center"/></w:pPr><w:r><w:t xml:space="preserve">Bạn cảm thấy hứng thú với chủ đề Hình học không gian (phương pháp tọa độ trong không gian) đã tăng lên.</w:t></w:r></w:p></w:tc><w:tc><w:tcPr><w:tcW w:w="1337" w:type="dxa"/></w:tcPr><w:p><w:pPr><w:jc w:val="center"/></w:pPr></w:p></w:tc><w:tc><w:tcPr><w:tcW w:w="1337" w:type="dxa"/></w:tcPr><w:p><w:pPr><w:jc w:val="center"/></w:pPr></w:p></w:tc><w:tc><w:tcPr><w:tcW w:w="1337" w:type="dxa"/></w:tcPr><w:p><w:pPr><w:jc w:val="center"/></w:pPr></w:p></w:tc><w:tc><w:tcPr><w:tcW w:w="1337" w:type="dxa"/></w:tcPr><w:p><w:pPr><w:jc w:val="center"/></w:pPr></w:p></w:tc><w:tc><w:tcPr><w:tcW w:w="1337" w:type="dxa"/></w:tcPr><w:p><w:pPr><w:jc w:val="center"/></w:pPr></w:p></w:tc></w:tr><w:tr><w:tc><w:tcPr><w:tcW w:w="1337" w:type="dxa"/></w:tcPr><w:p><w:pPr><w:jc w:val="center"/></w:pPr><w:r><w:t xml:space="preserve">3</w:t></w:r></w:p></w:tc><w:tc><w:tcPr><w:tcW w:w="1337" w:type="dxa"/></w:tcPr><w:p><w:pPr><w:jc w:val="center"/></w:pPr><w:r><w:t xml:space="preserve">Bạn cảm thấy hài lòng với phương pháp học có ứng dụng công nghệ số và mô hình 3D.</w:t></w:r></w:p></w:tc><w:tc><w:tcPr><w:tcW w:w="1337" w:type="dxa"/></w:tcPr><w:p><w:pPr><w:jc w:val="center"/></w:pPr></w:p></w:tc><w:tc><w:tcPr><w:tcW w:w="1337" w:type="dxa"/></w:tcPr><w:p><w:pPr><w:jc w:val="center"/></w:pPr></w:p></w:tc><w:tc><w:tcPr><w:tcW w:w="1337" w:type="dxa"/></w:tcPr><w:p><w:pPr><w:jc w:val="center"/></w:pPr></w:p></w:tc><w:tc><w:tcPr><w:tcW w:w="1337" w:type="dxa"/></w:tcPr><w:p><w:pPr><w:jc w:val="center"/></w:pPr></w:p></w:tc><w:tc><w:tcPr><w:tcW w:w="1337" w:type="dxa"/></w:tcPr><w:p><w:pPr><w:jc w:val="center"/></w:pPr></w:p></w:tc></w:tr><w:tr><w:tc><w:tcPr><w:tcW w:w="1337" w:type="dxa"/></w:tcPr><w:p><w:pPr><w:jc w:val="center"/></w:pPr><w:r><w:t xml:space="preserve">4</w:t></w:r></w:p></w:tc><w:tc><w:tcPr><w:tcW w:w="1337" w:type="dxa"/></w:tcPr><w:p><w:pPr><w:jc w:val="center"/></w:pPr><w:r><w:t xml:space="preserve">Bạn mong muốn giáo viên tiếp tục ứng dụng công nghệ số trong các bài giảng khác của môn Toán.</w:t></w:r></w:p></w:tc><w:tc><w:tcPr><w:tcW w:w="1337" w:type="dxa"/></w:tcPr><w:p><w:pPr><w:jc w:val="center"/></w:pPr></w:p></w:tc><w:tc><w:tcPr><w:tcW w:w="1337" w:type="dxa"/></w:tcPr><w:p><w:pPr><w:jc w:val="center"/></w:pPr></w:p></w:tc><w:tc><w:tcPr><w:tcW w:w="1337" w:type="dxa"/></w:tcPr><w:p><w:pPr><w:jc w:val="center"/></w:pPr></w:p></w:tc><w:tc><w:tcPr><w:tcW w:w="1337" w:type="dxa"/></w:tcPr><w:p><w:pPr><w:jc w:val="center"/></w:pPr></w:p></w:tc><w:tc><w:tcPr><w:tcW w:w="1337" w:type="dxa"/></w:tcPr><w:p><w:pPr><w:jc w:val="center"/></w:pPr></w:p></w:tc></w:tr><w:tr><w:tc><w:tcPr><w:tcW w:w="1337" w:type="dxa"/></w:tcPr><w:p><w:pPr><w:jc w:val="center"/></w:pPr><w:r><w:t xml:space="preserve">5</w:t></w:r></w:p></w:tc><w:tc><w:tcPr><w:tcW w:w="1337" w:type="dxa"/></w:tcPr><w:p><w:pPr><w:jc w:val="center"/></w:pPr><w:r><w:t xml:space="preserve">Bạn cảm thấy việc học bằng mô hình 3D đã giúp bạn nhận thấy rõ hơn tầm quan trọng của Hình học không gian trong thực tiễn.</w:t></w:r></w:p></w:tc><w:tc><w:tcPr><w:tcW w:w="1337" w:type="dxa"/></w:tcPr><w:p><w:pPr><w:jc w:val="center"/></w:pPr></w:p></w:tc><w:tc><w:tcPr><w:tcW w:w="1337" w:type="dxa"/></w:tcPr><w:p><w:pPr><w:jc w:val="center"/></w:pPr></w:p></w:tc><w:tc><w:tcPr><w:tcW w:w="1337" w:type="dxa"/></w:tcPr><w:p><w:pPr><w:jc w:val="center"/></w:pPr></w:p></w:tc><w:tc><w:tcPr><w:tcW w:w="1337" w:type="dxa"/></w:tcPr><w:p><w:pPr><w:jc w:val="center"/></w:pPr></w:p></w:tc><w:tc><w:tcPr><w:tcW w:w="1337" w:type="dxa"/></w:tcPr><w:p><w:pPr><w:jc w:val="center"/></w:pPr></w:p></w:tc></w:tr><w:tr><w:tc><w:tcPr><w:tcW w:w="1337" w:type="dxa"/></w:tcPr><w:p><w:pPr><w:jc w:val="center"/></w:pPr><w:r><w:rPr><w:b/></w:rPr><w:t xml:space="preserve">B. Mức độ hiểu bài và năng lực tưởng tượng không gian sau thực nghiệm</w:t></w:r></w:p></w:tc><w:tc><w:tcPr><w:tcW w:w="1337" w:type="dxa"/></w:tcPr><w:p><w:pPr><w:jc w:val="center"/></w:pPr></w:p></w:tc><w:tc><w:tcPr><w:tcW w:w="1337" w:type="dxa"/></w:tcPr><w:p><w:pPr><w:jc w:val="center"/></w:pPr></w:p></w:tc><w:tc><w:tcPr><w:tcW w:w="1337" w:type="dxa"/></w:tcPr><w:p><w:pPr><w:jc w:val="center"/></w:pPr></w:p></w:tc><w:tc><w:tcPr><w:tcW w:w="1337" w:type="dxa"/></w:tcPr><w:p><w:pPr><w:jc w:val="center"/></w:pPr></w:p></w:tc><w:tc><w:tcPr><w:tcW w:w="1337" w:type="dxa"/></w:tcPr><w:p><w:pPr><w:jc w:val="center"/></w:pPr></w:p></w:tc><w:tc><w:tcPr><w:tcW w:w="1337" w:type="dxa"/></w:tcPr><w:p><w:pPr><w:jc w:val="center"/></w:pPr></w:p></w:tc></w:tr><w:tr><w:tc><w:tcPr><w:tcW w:w="1337" w:type="dxa"/></w:tcPr><w:p><w:pPr><w:jc w:val="center"/></w:pPr><w:r><w:t xml:space="preserve">6</w:t></w:r></w:p></w:tc><w:tc><w:tcPr><w:tcW w:w="1337" w:type="dxa"/></w:tcPr><w:p><w:pPr><w:jc w:val="center"/></w:pPr><w:r><w:t xml:space="preserve">Bạn cảm thấy việc hình dung các đối tượng hình học không gian trong không gian ba chiều đã trở nên dễ dàng hơn.</w:t></w:r></w:p></w:tc><w:tc><w:tcPr><w:tcW w:w="1337" w:type="dxa"/></w:tcPr><w:p><w:pPr><w:jc w:val="center"/></w:pPr></w:p></w:tc><w:tc><w:tcPr><w:tcW w:w="1337" w:type="dxa"/></w:tcPr><w:p><w:pPr><w:jc w:val="center"/></w:pPr></w:p></w:tc><w:tc><w:tcPr><w:tcW w:w="1337" w:type="dxa"/></w:tcPr><w:p><w:pPr><w:jc w:val="center"/></w:pPr></w:p></w:tc><w:tc><w:tcPr><w:tcW w:w="1337" w:type="dxa"/></w:tcPr><w:p><w:pPr><w:jc w:val="center"/></w:pPr></w:p></w:tc><w:tc><w:tcPr><w:tcW w:w="1337" w:type="dxa"/></w:tcPr><w:p><w:pPr><w:jc w:val="center"/></w:pPr></w:p></w:tc></w:tr><w:tr><w:tc><w:tcPr><w:tcW w:w="1337" w:type="dxa"/></w:tcPr><w:p><w:pPr><w:jc w:val="center"/></w:pPr><w:r><w:t xml:space="preserve">7</w:t></w:r></w:p></w:tc><w:tc><w:tcPr><w:tcW w:w="1337" w:type="dxa"/></w:tcPr><w:p><w:pPr><w:jc w:val="center"/></w:pPr><w:r><w:t xml:space="preserve">Bạn tự tin hơn khi giải quyết các bài toán liên quan đến phương pháp tọa độ trong không gian.</w:t></w:r></w:p></w:tc><w:tc><w:tcPr><w:tcW w:w="1337" w:type="dxa"/></w:tcPr><w:p><w:pPr><w:jc w:val="center"/></w:pPr></w:p></w:tc><w:tc><w:tcPr><w:tcW w:w="1337" w:type="dxa"/></w:tcPr><w:p><w:pPr><w:jc w:val="center"/></w:pPr></w:p></w:tc><w:tc><w:tcPr><w:tcW w:w="1337" w:type="dxa"/></w:tcPr><w:p><w:pPr><w:jc w:val="center"/></w:pPr></w:p></w:tc><w:tc><w:tcPr><w:tcW w:w="1337" w:type="dxa"/></w:tcPr><w:p><w:pPr><w:jc w:val="center"/></w:pPr></w:p></w:tc><w:tc><w:tcPr><w:tcW w:w="1337" w:type="dxa"/></w:tcPr><w:p><w:pPr><w:jc w:val="center"/></w:pPr></w:p></w:tc></w:tr><w:tr><w:tc><w:tcPr><w:tcW w:w="1337" w:type="dxa"/></w:tcPr><w:p><w:pPr><w:jc w:val="center"/></w:pPr><w:r><w:t xml:space="preserve">8</w:t></w:r></w:p></w:tc><w:tc><w:tcPr><w:tcW w:w="1337" w:type="dxa"/></w:tcPr><w:p><w:pPr><w:jc w:val="center"/></w:pPr><w:r><w:t xml:space="preserve">Bạn cảm thấy mình hiểu sâu sắc hơn bản chất của các khái niệm hình học không gian.</w:t></w:r></w:p></w:tc><w:tc><w:tcPr><w:tcW w:w="1337" w:type="dxa"/></w:tcPr><w:p><w:pPr><w:jc w:val="center"/></w:pPr></w:p></w:tc><w:tc><w:tcPr><w:tcW w:w="1337" w:type="dxa"/></w:tcPr><w:p><w:pPr><w:jc w:val="center"/></w:pPr></w:p></w:tc><w:tc><w:tcPr><w:tcW w:w="1337" w:type="dxa"/></w:tcPr><w:p><w:pPr><w:jc w:val="center"/></w:pPr></w:p></w:tc><w:tc><w:tcPr><w:tcW w:w="1337" w:type="dxa"/></w:tcPr><w:p><w:pPr><w:jc w:val="center"/></w:pPr></w:p></w:tc><w:tc><w:tcPr><w:tcW w:w="1337" w:type="dxa"/></w:tcPr><w:p><w:pPr><w:jc w:val="center"/></w:pPr></w:p></w:tc></w:tr><w:tr><w:tc><w:tcPr><w:tcW w:w="1337" w:type="dxa"/></w:tcPr><w:p><w:pPr><w:jc w:val="center"/></w:pPr><w:r><w:t xml:space="preserve">9</w:t></w:r></w:p></w:tc><w:tc><w:tcPr><w:tcW w:w="1337" w:type="dxa"/></w:tcPr><w:p><w:pPr><w:jc w:val="center"/></w:pPr><w:r><w:t xml:space="preserve">Bạn có thể áp dụng kiến thức Hình học không gian một cách linh hoạt hơn vào giải quyết các bài toán thực tế.</w:t></w:r></w:p></w:tc><w:tc><w:tcPr><w:tcW w:w="1337" w:type="dxa"/></w:tcPr><w:p><w:pPr><w:jc w:val="center"/></w:pPr></w:p></w:tc><w:tc><w:tcPr><w:tcW w:w="1337" w:type="dxa"/></w:tcPr><w:p><w:pPr><w:jc w:val="center"/></w:pPr></w:p></w:tc><w:tc><w:tcPr><w:tcW w:w="1337" w:type="dxa"/></w:tcPr><w:p><w:pPr><w:jc w:val="center"/></w:pPr></w:p></w:tc><w:tc><w:tcPr><w:tcW w:w="1337" w:type="dxa"/></w:tcPr><w:p><w:pPr><w:jc w:val="center"/></w:pPr></w:p></w:tc><w:tc><w:tcPr><w:tcW w:w="1337" w:type="dxa"/></w:tcPr><w:p><w:pPr><w:jc w:val="center"/></w:pPr></w:p></w:tc></w:tr><w:tr><w:tc><w:tcPr><w:tcW w:w="1337" w:type="dxa"/></w:tcPr><w:p><w:pPr><w:jc w:val="center"/></w:pPr><w:r><w:t xml:space="preserve">10</w:t></w:r></w:p></w:tc><w:tc><w:tcPr><w:tcW w:w="1337" w:type="dxa"/></w:tcPr><w:p><w:pPr><w:jc w:val="center"/></w:pPr><w:r><w:t xml:space="preserve">Bạn cảm thấy việc biểu diễn và phân tích các hình không gian 3D trên máy tính/thiết bị đã giúp bạn khắc phục khó khăn khi vẽ trên giấy.</w:t></w:r></w:p></w:tc><w:tc><w:tcPr><w:tcW w:w="1337" w:type="dxa"/></w:tcPr><w:p><w:pPr><w:jc w:val="center"/></w:pPr></w:p></w:tc><w:tc><w:tcPr><w:tcW w:w="1337" w:type="dxa"/></w:tcPr><w:p><w:pPr><w:jc w:val="center"/></w:pPr></w:p></w:tc><w:tc><w:tcPr><w:tcW w:w="1337" w:type="dxa"/></w:tcPr><w:p><w:pPr><w:jc w:val="center"/></w:pPr></w:p></w:tc><w:tc><w:tcPr><w:tcW w:w="1337" w:type="dxa"/></w:tcPr><w:p><w:pPr><w:jc w:val="center"/></w:pPr></w:p></w:tc><w:tc><w:tcPr><w:tcW w:w="1337" w:type="dxa"/></w:tcPr><w:p><w:pPr><w:jc w:val="center"/></w:pPr></w:p></w:tc></w:tr><w:tr><w:tc><w:tcPr><w:tcW w:w="1337" w:type="dxa"/></w:tcPr><w:p><w:pPr><w:jc w:val="center"/></w:pPr><w:r><w:rPr><w:b/></w:rPr><w:t xml:space="preserve">C. Hiệu quả của phương pháp và kỹ năng thực hành</w:t></w:r></w:p></w:tc><w:tc><w:tcPr><w:tcW w:w="1337" w:type="dxa"/></w:tcPr><w:p><w:pPr><w:jc w:val="center"/></w:pPr></w:p></w:tc><w:tc><w:tcPr><w:tcW w:w="1337" w:type="dxa"/></w:tcPr><w:p><w:pPr><w:jc w:val="center"/></w:pPr></w:p></w:tc><w:tc><w:tcPr><w:tcW w:w="1337" w:type="dxa"/></w:tcPr><w:p><w:pPr><w:jc w:val="center"/></w:pPr></w:p></w:tc><w:tc><w:tcPr><w:tcW w:w="1337" w:type="dxa"/></w:tcPr><w:p><w:pPr><w:jc w:val="center"/></w:pPr></w:p></w:tc><w:tc><w:tcPr><w:tcW w:w="1337" w:type="dxa"/></w:tcPr><w:p><w:pPr><w:jc w:val="center"/></w:pPr></w:p></w:tc><w:tc><w:tcPr><w:tcW w:w="1337" w:type="dxa"/></w:tcPr><w:p><w:pPr><w:jc w:val="center"/></w:pPr></w:p></w:tc></w:tr><w:tr><w:tc><w:tcPr><w:tcW w:w="1337" w:type="dxa"/></w:tcPr><w:p><w:pPr><w:jc w:val="center"/></w:pPr><w:r><w:t xml:space="preserve">11</w:t></w:r></w:p></w:tc><w:tc><w:tcPr><w:tcW w:w="1337" w:type="dxa"/></w:tcPr><w:p><w:pPr><w:jc w:val="center"/></w:pPr><w:r><w:t xml:space="preserve">Bạn cảm thấy năng lực tưởng tượng không gian của mình đã được cải thiện đáng kể sau khi học bằng mô hình 3D.</w:t></w:r></w:p></w:tc><w:tc><w:tcPr><w:tcW w:w="1337" w:type="dxa"/></w:tcPr><w:p><w:pPr><w:jc w:val="center"/></w:pPr></w:p></w:tc><w:tc><w:tcPr><w:tcW w:w="1337" w:type="dxa"/></w:tcPr><w:p><w:pPr><w:jc w:val="center"/></w:pPr></w:p></w:tc><w:tc><w:tcPr><w:tcW w:w="1337" w:type="dxa"/></w:tcPr><w:p><w:pPr><w:jc w:val="center"/></w:pPr></w:p></w:tc><w:tc><w:tcPr><w:tcW w:w="1337" w:type="dxa"/></w:tcPr><w:p><w:pPr><w:jc w:val="center"/></w:pPr></w:p></w:tc><w:tc><w:tcPr><w:tcW w:w="1337" w:type="dxa"/></w:tcPr><w:p><w:pPr><w:jc w:val="center"/></w:pPr></w:p></w:tc></w:tr><w:tr><w:tc><w:tcPr><w:tcW w:w="1337" w:type="dxa"/></w:tcPr><w:p><w:pPr><w:jc w:val="center"/></w:pPr><w:r><w:t xml:space="preserve">12</w:t></w:r></w:p></w:tc><w:tc><w:tcPr><w:tcW w:w="1337" w:type="dxa"/></w:tcPr><w:p><w:pPr><w:jc w:val="center"/></w:pPr><w:r><w:t xml:space="preserve">Bạn tự tin hơn trong việc thao tác và khám phá các mô hình 3D để học tập và giải bài tập.</w:t></w:r></w:p></w:tc><w:tc><w:tcPr><w:tcW w:w="1337" w:type="dxa"/></w:tcPr><w:p><w:pPr><w:jc w:val="center"/></w:pPr></w:p></w:tc><w:tc><w:tcPr><w:tcW w:w="1337" w:type="dxa"/></w:tcPr><w:p><w:pPr><w:jc w:val="center"/></w:pPr></w:p></w:tc><w:tc><w:tcPr><w:tcW w:w="1337" w:type="dxa"/></w:tcPr><w:p><w:pPr><w:jc w:val="center"/></w:pPr></w:p></w:tc><w:tc><w:tcPr><w:tcW w:w="1337" w:type="dxa"/></w:tcPr><w:p><w:pPr><w:jc w:val="center"/></w:pPr></w:p></w:tc><w:tc><w:tcPr><w:tcW w:w="1337" w:type="dxa"/></w:tcPr><w:p><w:pPr><w:jc w:val="center"/></w:pPr></w:p></w:tc></w:tr><w:tr><w:tc><w:tcPr><w:tcW w:w="1337" w:type="dxa"/></w:tcPr><w:p><w:pPr><w:jc w:val="center"/></w:pPr><w:r><w:t xml:space="preserve">13</w:t></w:r></w:p></w:tc><w:tc><w:tcPr><w:tcW w:w="1337" w:type="dxa"/></w:tcPr><w:p><w:pPr><w:jc w:val="center"/></w:pPr><w:r><w:t xml:space="preserve">Bạn cảm thấy việc học bằng mô hình 3D giúp bạn chủ động hơn trong việc tìm tòi và khám phá kiến thức mới.</w:t></w:r></w:p></w:tc><w:tc><w:tcPr><w:tcW w:w="1337" w:type="dxa"/></w:tcPr><w:p><w:pPr><w:jc w:val="center"/></w:pPr></w:p></w:tc><w:tc><w:tcPr><w:tcW w:w="1337" w:type="dxa"/></w:tcPr><w:p><w:pPr><w:jc w:val="center"/></w:pPr></w:p></w:tc><w:tc><w:tcPr><w:tcW w:w="1337" w:type="dxa"/></w:tcPr><w:p><w:pPr><w:jc w:val="center"/></w:pPr></w:p></w:tc><w:tc><w:tcPr><w:tcW w:w="1337" w:type="dxa"/></w:tcPr><w:p><w:pPr><w:jc w:val="center"/></w:pPr></w:p></w:tc><w:tc><w:tcPr><w:tcW w:w="1337" w:type="dxa"/></w:tcPr><w:p><w:pPr><w:jc w:val="center"/></w:pPr></w:p></w:tc></w:tr><w:tr><w:tc><w:tcPr><w:tcW w:w="1337" w:type="dxa"/></w:tcPr><w:p><w:pPr><w:jc w:val="center"/></w:pPr><w:r><w:t xml:space="preserve">14</w:t></w:r></w:p></w:tc><w:tc><w:tcPr><w:tcW w:w="1337" w:type="dxa"/></w:tcPr><w:p><w:pPr><w:jc w:val="center"/></w:pPr><w:r><w:t xml:space="preserve">Bạn cảm thấy việc sử dụng công nghệ số trong học tập giúp bạn ghi nhớ kiến thức lâu hơn và hiệu quả hơn.</w:t></w:r></w:p></w:tc><w:tc><w:tcPr><w:tcW w:w="1337" w:type="dxa"/></w:tcPr><w:p><w:pPr><w:jc w:val="center"/></w:pPr></w:p></w:tc><w:tc><w:tcPr><w:tcW w:w="1337" w:type="dxa"/></w:tcPr><w:p><w:pPr><w:jc w:val="center"/></w:pPr></w:p></w:tc><w:tc><w:tcPr><w:tcW w:w="1337" w:type="dxa"/></w:tcPr><w:p><w:pPr><w:jc w:val="center"/></w:pPr></w:p></w:tc><w:tc><w:tcPr><w:tcW w:w="1337" w:type="dxa"/></w:tcPr><w:p><w:pPr><w:jc w:val="center"/></w:pPr></w:p></w:tc><w:tc><w:tcPr><w:tcW w:w="1337" w:type="dxa"/></w:tcPr><w:p><w:pPr><w:jc w:val="center"/></w:pPr></w:p></w:tc></w:tr><w:tr><w:tc><w:tcPr><w:tcW w:w="1337" w:type="dxa"/></w:tcPr><w:p><w:pPr><w:jc w:val="center"/></w:pPr><w:r><w:t xml:space="preserve">15</w:t></w:r></w:p></w:tc><w:tc><w:tcPr><w:tcW w:w="1337" w:type="dxa"/></w:tcPr><w:p><w:pPr><w:jc w:val="center"/></w:pPr><w:r><w:t xml:space="preserve">Bạn cảm thấy việc học Hình học không gian đã trở nên ít căng thẳng và thú vị hơn nhờ phương pháp mới.</w:t></w:r></w:p></w:tc><w:tc><w:tcPr><w:tcW w:w="1337" w:type="dxa"/></w:tcPr><w:p><w:pPr><w:jc w:val="center"/></w:pPr></w:p></w:tc><w:tc><w:tcPr><w:tcW w:w="1337" w:type="dxa"/></w:tcPr><w:p><w:pPr><w:jc w:val="center"/></w:pPr></w:p></w:tc><w:tc><w:tcPr><w:tcW w:w="1337" w:type="dxa"/></w:tcPr><w:p><w:pPr><w:jc w:val="center"/></w:pPr></w:p></w:tc><w:tc><w:tcPr><w:tcW w:w="1337" w:type="dxa"/></w:tcPr><w:p><w:pPr><w:jc w:val="center"/></w:pPr></w:p></w:tc><w:tc><w:tcPr><w:tcW w:w="1337" w:type="dxa"/></w:tcPr><w:p><w:pPr><w:jc w:val="center"/></w:pPr></w:p></w:tc></w:tr></w:tbl><w:p><w:pPr><w:spacing w:after="120"/></w:pPr></w:p><w:sectPr><w:headerReference w:type="even" r:id="rId7"/><w:headerReference w:type="default" r:id="rId8"/><w:footerReference w:type="even" r:id="rId9"/><w:footerReference w:type="default" r:id="rId10"/><w:headerReference w:type="first" r:id="rId11"/><w:footerReference w:type="first" r:id="rId12"/><w:pgSz w:w="11906" w:h="16838"/><w:pgMar w:top="1134" w:right="1134" w:bottom="1134" w:left="1701" w:header="708" w:footer="708" w:gutter="0"/><w:pgNumType w:start="1"/><w:cols w:space="720"/><w:docGrid w:linePitch="360"/></w:sectPr></w:body></w:document>
 </file>
 
 <file path=word/endnotes.xml><?xml version="1.0" encoding="utf-8"?>

</xml_diff>